<commit_message>
Remove redundant per-run focal length chart (old fig A-5)
Co-Authored-By: Claude Opus 5.5 <noreply@anthropic.com>
Claude-Session: https://claude.ai/code/session_01FwXsc2JBiGHJi72V8HsJjh
</commit_message>
<xml_diff>
--- a/report_optics/レンズの焦点距離の測定とレーザー光の回折と干渉_報告書.docx
+++ b/report_optics/レンズの焦点距離の測定とレーザー光の回折と干渉_報告書.docx
@@ -6213,58 +6213,6 @@
     </w:p>
     <w:p>
       <w:pPr>
-        <w:spacing w:before="0" w:after="80" w:line="324" w:lineRule="auto"/>
-        <w:ind w:firstLine="210"/>
-      </w:pPr>
-      <w:r>
-        <w:rPr>
-          <w:rFonts w:ascii="Times New Roman" w:hAnsi="Times New Roman" w:eastAsia="ＭＳ 明朝"/>
-          <w:b w:val="0"/>
-          <w:color w:val="000000"/>
-          <w:sz w:val="21"/>
-        </w:rPr>
-        <w:t>3つの測定で得た各回の焦点距離を図A-5に示す．</w:t>
-      </w:r>
-    </w:p>
-    <w:p>
-      <w:pPr>
-        <w:keepNext/>
-        <w:spacing w:before="120" w:after="40" w:line="324" w:lineRule="auto"/>
-        <w:jc w:val="center"/>
-      </w:pPr>
-      <w:r>
-        <w:drawing xmlns:a="http://schemas.openxmlformats.org/drawingml/2006/main" xmlns:c="http://schemas.openxmlformats.org/drawingml/2006/chart">
-          <wp:inline distT="0" distB="0" distL="0" distR="0">
-            <wp:extent cx="4320000" cy="2430000"/>
-            <wp:effectExtent l="0" t="0" r="0" b="0"/>
-            <wp:docPr id="5002" name="グラフ 2"/>
-            <wp:cNvGraphicFramePr/>
-            <a:graphic>
-              <a:graphicData uri="http://schemas.openxmlformats.org/drawingml/2006/chart">
-                <c:chart r:id="rId30"/>
-              </a:graphicData>
-            </a:graphic>
-          </wp:inline>
-        </w:drawing>
-      </w:r>
-    </w:p>
-    <w:p>
-      <w:pPr>
-        <w:spacing w:before="0" w:after="200" w:line="324" w:lineRule="auto"/>
-        <w:jc w:val="center"/>
-      </w:pPr>
-      <w:r>
-        <w:rPr>
-          <w:rFonts w:ascii="Times New Roman" w:hAnsi="Times New Roman" w:eastAsia="ＭＳ 明朝"/>
-          <w:b w:val="0"/>
-          <w:color w:val="000000"/>
-          <w:sz w:val="19"/>
-        </w:rPr>
-        <w:t>図A-5　各回の測定で得た焦点距離</w:t>
-      </w:r>
-    </w:p>
-    <w:p>
-      <w:pPr>
         <w:keepNext/>
         <w:spacing w:before="180" w:after="100" w:line="324" w:lineRule="auto"/>
       </w:pPr>
@@ -6680,7 +6628,7 @@
                     <pic:cNvPicPr/>
                   </pic:nvPicPr>
                   <pic:blipFill>
-                    <a:blip r:embed="rId31"/>
+                    <a:blip r:embed="rId30"/>
                     <a:stretch>
                       <a:fillRect/>
                     </a:stretch>
@@ -6746,7 +6694,7 @@
                     <pic:cNvPicPr/>
                   </pic:nvPicPr>
                   <pic:blipFill>
-                    <a:blip r:embed="rId32"/>
+                    <a:blip r:embed="rId31"/>
                     <a:stretch>
                       <a:fillRect/>
                     </a:stretch>
@@ -7361,7 +7309,7 @@
                     <pic:cNvPicPr/>
                   </pic:nvPicPr>
                   <pic:blipFill>
-                    <a:blip r:embed="rId33"/>
+                    <a:blip r:embed="rId32"/>
                     <a:stretch>
                       <a:fillRect/>
                     </a:stretch>
@@ -7823,7 +7771,7 @@
                     <pic:cNvPicPr/>
                   </pic:nvPicPr>
                   <pic:blipFill>
-                    <a:blip r:embed="rId34"/>
+                    <a:blip r:embed="rId33"/>
                     <a:stretch>
                       <a:fillRect/>
                     </a:stretch>
@@ -7957,7 +7905,7 @@
                     <pic:cNvPicPr/>
                   </pic:nvPicPr>
                   <pic:blipFill>
-                    <a:blip r:embed="rId35"/>
+                    <a:blip r:embed="rId34"/>
                     <a:stretch>
                       <a:fillRect/>
                     </a:stretch>
@@ -8216,7 +8164,7 @@
                     <pic:cNvPicPr/>
                   </pic:nvPicPr>
                   <pic:blipFill>
-                    <a:blip r:embed="rId36"/>
+                    <a:blip r:embed="rId35"/>
                     <a:stretch>
                       <a:fillRect/>
                     </a:stretch>
@@ -8524,7 +8472,7 @@
                     <pic:cNvPicPr/>
                   </pic:nvPicPr>
                   <pic:blipFill>
-                    <a:blip r:embed="rId37"/>
+                    <a:blip r:embed="rId36"/>
                     <a:stretch>
                       <a:fillRect/>
                     </a:stretch>
@@ -8656,7 +8604,7 @@
                     <pic:cNvPicPr/>
                   </pic:nvPicPr>
                   <pic:blipFill>
-                    <a:blip r:embed="rId38"/>
+                    <a:blip r:embed="rId37"/>
                     <a:stretch>
                       <a:fillRect/>
                     </a:stretch>
@@ -8721,7 +8669,7 @@
                     <pic:cNvPicPr/>
                   </pic:nvPicPr>
                   <pic:blipFill>
-                    <a:blip r:embed="rId39"/>
+                    <a:blip r:embed="rId38"/>
                     <a:stretch>
                       <a:fillRect/>
                     </a:stretch>
@@ -8912,7 +8860,7 @@
                     <pic:cNvPicPr/>
                   </pic:nvPicPr>
                   <pic:blipFill>
-                    <a:blip r:embed="rId40"/>
+                    <a:blip r:embed="rId39"/>
                     <a:stretch>
                       <a:fillRect/>
                     </a:stretch>
@@ -9017,7 +8965,7 @@
                     <pic:cNvPicPr/>
                   </pic:nvPicPr>
                   <pic:blipFill>
-                    <a:blip r:embed="rId41"/>
+                    <a:blip r:embed="rId40"/>
                     <a:stretch>
                       <a:fillRect/>
                     </a:stretch>
@@ -9092,7 +9040,7 @@
                     <pic:cNvPicPr/>
                   </pic:nvPicPr>
                   <pic:blipFill>
-                    <a:blip r:embed="rId42"/>
+                    <a:blip r:embed="rId41"/>
                     <a:stretch>
                       <a:fillRect/>
                     </a:stretch>
@@ -9167,7 +9115,7 @@
                     <pic:cNvPicPr/>
                   </pic:nvPicPr>
                   <pic:blipFill>
-                    <a:blip r:embed="rId43"/>
+                    <a:blip r:embed="rId42"/>
                     <a:stretch>
                       <a:fillRect/>
                     </a:stretch>
@@ -9232,7 +9180,7 @@
                     <pic:cNvPicPr/>
                   </pic:nvPicPr>
                   <pic:blipFill>
-                    <a:blip r:embed="rId44"/>
+                    <a:blip r:embed="rId43"/>
                     <a:stretch>
                       <a:fillRect/>
                     </a:stretch>
@@ -9328,7 +9276,7 @@
                     <pic:cNvPicPr/>
                   </pic:nvPicPr>
                   <pic:blipFill>
-                    <a:blip r:embed="rId45"/>
+                    <a:blip r:embed="rId44"/>
                     <a:stretch>
                       <a:fillRect/>
                     </a:stretch>
@@ -9422,7 +9370,7 @@
                     <pic:cNvPicPr/>
                   </pic:nvPicPr>
                   <pic:blipFill>
-                    <a:blip r:embed="rId38"/>
+                    <a:blip r:embed="rId37"/>
                     <a:stretch>
                       <a:fillRect/>
                     </a:stretch>
@@ -10799,7 +10747,7 @@
                     <pic:cNvPicPr/>
                   </pic:nvPicPr>
                   <pic:blipFill>
-                    <a:blip r:embed="rId46"/>
+                    <a:blip r:embed="rId45"/>
                     <a:stretch>
                       <a:fillRect/>
                     </a:stretch>
@@ -11397,7 +11345,7 @@
                     <pic:cNvPicPr/>
                   </pic:nvPicPr>
                   <pic:blipFill>
-                    <a:blip r:embed="rId47"/>
+                    <a:blip r:embed="rId46"/>
                     <a:stretch>
                       <a:fillRect/>
                     </a:stretch>
@@ -11836,7 +11784,7 @@
                     <pic:cNvPicPr/>
                   </pic:nvPicPr>
                   <pic:blipFill>
-                    <a:blip r:embed="rId48"/>
+                    <a:blip r:embed="rId47"/>
                     <a:stretch>
                       <a:fillRect/>
                     </a:stretch>
@@ -11917,7 +11865,7 @@
                     <pic:cNvPicPr/>
                   </pic:nvPicPr>
                   <pic:blipFill>
-                    <a:blip r:embed="rId49"/>
+                    <a:blip r:embed="rId48"/>
                     <a:stretch>
                       <a:fillRect/>
                     </a:stretch>
@@ -11977,11 +11925,11 @@
           <wp:inline distT="0" distB="0" distL="0" distR="0">
             <wp:extent cx="4140000" cy="2587500"/>
             <wp:effectExtent l="0" t="0" r="0" b="0"/>
-            <wp:docPr id="5003" name="グラフ 3"/>
+            <wp:docPr id="5002" name="グラフ 2"/>
             <wp:cNvGraphicFramePr/>
             <a:graphic>
               <a:graphicData uri="http://schemas.openxmlformats.org/drawingml/2006/chart">
-                <c:chart r:id="rId50"/>
+                <c:chart r:id="rId49"/>
               </a:graphicData>
             </a:graphic>
           </wp:inline>
@@ -12086,11 +12034,11 @@
           <wp:inline distT="0" distB="0" distL="0" distR="0">
             <wp:extent cx="4140000" cy="2458125"/>
             <wp:effectExtent l="0" t="0" r="0" b="0"/>
-            <wp:docPr id="5004" name="グラフ 4"/>
+            <wp:docPr id="5003" name="グラフ 3"/>
             <wp:cNvGraphicFramePr/>
             <a:graphic>
               <a:graphicData uri="http://schemas.openxmlformats.org/drawingml/2006/chart">
-                <c:chart r:id="rId51"/>
+                <c:chart r:id="rId50"/>
               </a:graphicData>
             </a:graphic>
           </wp:inline>
@@ -13338,7 +13286,7 @@
       </w:r>
     </w:p>
     <w:sectPr>
-      <w:footerReference w:type="default" r:id="rId52"/>
+      <w:footerReference w:type="default" r:id="rId51"/>
       <w:pgSz w:w="11906" w:h="16838"/>
       <w:pgMar w:top="1417" w:right="1417" w:bottom="1417" w:left="1417" w:header="720" w:footer="720" w:gutter="0"/>
       <w:cols w:space="720"/>
@@ -37624,367 +37572,6 @@
           <idx val="0"/>
           <order val="0"/>
           <tx>
-            <v>凸レンズ（レンズの公式）</v>
-          </tx>
-          <spPr>
-            <a:ln xmlns:a="http://schemas.openxmlformats.org/drawingml/2006/main" w="19050">
-              <a:solidFill>
-                <a:srgbClr val="4472C4"/>
-              </a:solidFill>
-              <a:prstDash val="solid"/>
-            </a:ln>
-          </spPr>
-          <marker>
-            <symbol val="circle"/>
-            <size val="7"/>
-            <spPr>
-              <a:solidFill xmlns:a="http://schemas.openxmlformats.org/drawingml/2006/main">
-                <a:srgbClr val="4472C4"/>
-              </a:solidFill>
-              <a:ln xmlns:a="http://schemas.openxmlformats.org/drawingml/2006/main" w="9525">
-                <a:solidFill>
-                  <a:srgbClr val="4472C4"/>
-                </a:solidFill>
-                <a:prstDash val="solid"/>
-              </a:ln>
-            </spPr>
-          </marker>
-          <xVal>
-            <numRef>
-              <f>'f'!$A$2:$A$5</f>
-              <numCache>
-                <formatCode>General</formatCode>
-                <ptCount val="4"/>
-                <pt idx="0">
-                  <v>1.0</v>
-                </pt>
-                <pt idx="1">
-                  <v>2.0</v>
-                </pt>
-                <pt idx="2">
-                  <v>3.0</v>
-                </pt>
-                <pt idx="3">
-                  <v>4.0</v>
-                </pt>
-              </numCache>
-            </numRef>
-          </xVal>
-          <yVal>
-            <numRef>
-              <f>'f'!$B$2:$B$5</f>
-              <numCache>
-                <formatCode>General</formatCode>
-                <ptCount val="4"/>
-                <pt idx="0">
-                  <v>24.432565616638282</v>
-                </pt>
-                <pt idx="1">
-                  <v>24.38085192522688</v>
-                </pt>
-                <pt idx="2">
-                  <v>24.9807506840796</v>
-                </pt>
-                <pt idx="3">
-                  <v>24.286287903577662</v>
-                </pt>
-              </numCache>
-            </numRef>
-          </yVal>
-        </ser>
-        <ser>
-          <idx val="1"/>
-          <order val="1"/>
-          <tx>
-            <v>凸レンズ（ベッセルの方法）</v>
-          </tx>
-          <spPr>
-            <a:ln xmlns:a="http://schemas.openxmlformats.org/drawingml/2006/main" w="19050">
-              <a:solidFill>
-                <a:srgbClr val="ED7D31"/>
-              </a:solidFill>
-              <a:prstDash val="solid"/>
-            </a:ln>
-          </spPr>
-          <marker>
-            <symbol val="circle"/>
-            <size val="7"/>
-            <spPr>
-              <a:solidFill xmlns:a="http://schemas.openxmlformats.org/drawingml/2006/main">
-                <a:srgbClr val="ED7D31"/>
-              </a:solidFill>
-              <a:ln xmlns:a="http://schemas.openxmlformats.org/drawingml/2006/main" w="9525">
-                <a:solidFill>
-                  <a:srgbClr val="ED7D31"/>
-                </a:solidFill>
-                <a:prstDash val="solid"/>
-              </a:ln>
-            </spPr>
-          </marker>
-          <xVal>
-            <numRef>
-              <f>'f'!$A$2:$A$5</f>
-              <numCache>
-                <formatCode>General</formatCode>
-                <ptCount val="4"/>
-                <pt idx="0">
-                  <v>1.0</v>
-                </pt>
-                <pt idx="1">
-                  <v>2.0</v>
-                </pt>
-                <pt idx="2">
-                  <v>3.0</v>
-                </pt>
-                <pt idx="3">
-                  <v>4.0</v>
-                </pt>
-              </numCache>
-            </numRef>
-          </xVal>
-          <yVal>
-            <numRef>
-              <f>'f'!$C$2:$C$5</f>
-              <numCache>
-                <formatCode>General</formatCode>
-                <ptCount val="4"/>
-                <pt idx="0">
-                  <v>24.47215939781407</v>
-                </pt>
-                <pt idx="1">
-                  <v>24.520708333333335</v>
-                </pt>
-                <pt idx="2">
-                  <v>24.468064377328243</v>
-                </pt>
-                <pt idx="3">
-                  <v>24.850687324602433</v>
-                </pt>
-              </numCache>
-            </numRef>
-          </yVal>
-        </ser>
-        <ser>
-          <idx val="2"/>
-          <order val="2"/>
-          <tx>
-            <v>凹レンズ</v>
-          </tx>
-          <spPr>
-            <a:ln xmlns:a="http://schemas.openxmlformats.org/drawingml/2006/main" w="19050">
-              <a:solidFill>
-                <a:srgbClr val="A5A5A5"/>
-              </a:solidFill>
-              <a:prstDash val="solid"/>
-            </a:ln>
-          </spPr>
-          <marker>
-            <symbol val="circle"/>
-            <size val="7"/>
-            <spPr>
-              <a:solidFill xmlns:a="http://schemas.openxmlformats.org/drawingml/2006/main">
-                <a:srgbClr val="A5A5A5"/>
-              </a:solidFill>
-              <a:ln xmlns:a="http://schemas.openxmlformats.org/drawingml/2006/main" w="9525">
-                <a:solidFill>
-                  <a:srgbClr val="A5A5A5"/>
-                </a:solidFill>
-                <a:prstDash val="solid"/>
-              </a:ln>
-            </spPr>
-          </marker>
-          <xVal>
-            <numRef>
-              <f>'f'!$A$2:$A$5</f>
-              <numCache>
-                <formatCode>General</formatCode>
-                <ptCount val="4"/>
-                <pt idx="0">
-                  <v>1.0</v>
-                </pt>
-                <pt idx="1">
-                  <v>2.0</v>
-                </pt>
-                <pt idx="2">
-                  <v>3.0</v>
-                </pt>
-                <pt idx="3">
-                  <v>4.0</v>
-                </pt>
-              </numCache>
-            </numRef>
-          </xVal>
-          <yVal>
-            <numRef>
-              <f>'f'!$D$2:$D$5</f>
-              <numCache>
-                <formatCode>General</formatCode>
-                <ptCount val="4"/>
-                <pt idx="0">
-                  <v>24.807531380753122</v>
-                </pt>
-                <pt idx="1">
-                  <v>26.897042034250134</v>
-                </pt>
-                <pt idx="2">
-                  <v>24.46564712466768</v>
-                </pt>
-                <pt idx="3">
-                  <v>24.380487804878037</v>
-                </pt>
-              </numCache>
-            </numRef>
-          </yVal>
-        </ser>
-        <axId val="10"/>
-        <axId val="20"/>
-      </scatterChart>
-      <valAx>
-        <axId val="10"/>
-        <scaling>
-          <orientation val="minMax"/>
-          <max val="4.5"/>
-          <min val="0.5"/>
-        </scaling>
-        <delete val="0"/>
-        <axPos val="l"/>
-        <majorGridlines>
-          <spPr>
-            <a:ln xmlns:a="http://schemas.openxmlformats.org/drawingml/2006/main" w="9525">
-              <a:solidFill>
-                <a:srgbClr val="D9D9D9"/>
-              </a:solidFill>
-              <a:prstDash val="solid"/>
-            </a:ln>
-          </spPr>
-        </majorGridlines>
-        <title>
-          <tx>
-            <rich>
-              <a:bodyPr xmlns:a="http://schemas.openxmlformats.org/drawingml/2006/main"/>
-              <a:p xmlns:a="http://schemas.openxmlformats.org/drawingml/2006/main">
-                <a:pPr>
-                  <a:defRPr/>
-                </a:pPr>
-                <a:r>
-                  <a:t>測定回</a:t>
-                </a:r>
-              </a:p>
-            </rich>
-          </tx>
-          <overlay val="0"/>
-        </title>
-        <numFmt formatCode="General" sourceLinked="0"/>
-        <majorTickMark val="none"/>
-        <minorTickMark val="none"/>
-        <spPr>
-          <a:ln xmlns:a="http://schemas.openxmlformats.org/drawingml/2006/main" w="9525">
-            <a:solidFill>
-              <a:srgbClr val="D9D9D9"/>
-            </a:solidFill>
-            <a:prstDash val="solid"/>
-          </a:ln>
-        </spPr>
-        <crossAx val="20"/>
-        <majorUnit val="1"/>
-      </valAx>
-      <valAx>
-        <axId val="20"/>
-        <scaling>
-          <orientation val="minMax"/>
-          <max val="28"/>
-          <min val="23"/>
-        </scaling>
-        <delete val="0"/>
-        <axPos val="l"/>
-        <majorGridlines>
-          <spPr>
-            <a:ln xmlns:a="http://schemas.openxmlformats.org/drawingml/2006/main" w="9525">
-              <a:solidFill>
-                <a:srgbClr val="D9D9D9"/>
-              </a:solidFill>
-              <a:prstDash val="solid"/>
-            </a:ln>
-          </spPr>
-        </majorGridlines>
-        <title>
-          <tx>
-            <rich>
-              <a:bodyPr xmlns:a="http://schemas.openxmlformats.org/drawingml/2006/main"/>
-              <a:p xmlns:a="http://schemas.openxmlformats.org/drawingml/2006/main">
-                <a:pPr>
-                  <a:defRPr/>
-                </a:pPr>
-                <a:r>
-                  <a:t>焦点距離 [cm]</a:t>
-                </a:r>
-              </a:p>
-            </rich>
-          </tx>
-          <overlay val="0"/>
-        </title>
-        <numFmt formatCode="General" sourceLinked="0"/>
-        <majorTickMark val="none"/>
-        <minorTickMark val="none"/>
-        <spPr>
-          <a:ln xmlns:a="http://schemas.openxmlformats.org/drawingml/2006/main" w="9525">
-            <a:solidFill>
-              <a:srgbClr val="D9D9D9"/>
-            </a:solidFill>
-            <a:prstDash val="solid"/>
-          </a:ln>
-        </spPr>
-        <crossAx val="10"/>
-        <majorUnit val="1"/>
-      </valAx>
-    </plotArea>
-    <legend>
-      <legendPos val="b"/>
-      <overlay val="0"/>
-    </legend>
-    <plotVisOnly val="1"/>
-    <dispBlanksAs val="gap"/>
-  </chart>
-  <spPr>
-    <a:ln xmlns:a="http://schemas.openxmlformats.org/drawingml/2006/main">
-      <a:noFill/>
-      <a:prstDash val="solid"/>
-    </a:ln>
-  </spPr>
-  <txPr xmlns:a="http://schemas.openxmlformats.org/drawingml/2006/main">
-    <a:bodyPr/>
-    <a:lstStyle/>
-    <a:p>
-      <a:pPr>
-        <a:defRPr sz="900">
-          <a:solidFill>
-            <a:srgbClr val="595959"/>
-          </a:solidFill>
-          <a:latin typeface="游ゴシック"/>
-          <a:ea typeface="游ゴシック"/>
-        </a:defRPr>
-      </a:pPr>
-      <a:endParaRPr lang="ja-JP"/>
-    </a:p>
-  </txPr>
-  <externalData xmlns:r="http://schemas.openxmlformats.org/officeDocument/2006/relationships" r:id="rId1">
-    <autoUpdate val="0"/>
-  </externalData>
-</chartSpace>
-</file>
-
-<file path=word/charts/chart3.xml><?xml version="1.0" encoding="utf-8"?>
-<chartSpace xmlns="http://schemas.openxmlformats.org/drawingml/2006/chart">
-  <roundedCorners val="0"/>
-  <style val="2"/>
-  <chart>
-    <autoTitleDeleted val="1"/>
-    <plotArea>
-      <scatterChart>
-        <ser>
-          <idx val="0"/>
-          <order val="0"/>
-          <tx>
             <v>測定値＝公称値</v>
           </tx>
           <spPr>
@@ -38393,7 +37980,7 @@
 </chartSpace>
 </file>
 
-<file path=word/charts/chart4.xml><?xml version="1.0" encoding="utf-8"?>
+<file path=word/charts/chart3.xml><?xml version="1.0" encoding="utf-8"?>
 <chartSpace xmlns="http://schemas.openxmlformats.org/drawingml/2006/chart">
   <roundedCorners val="0"/>
   <style val="2"/>

</xml_diff>